<commit_message>
Integrate completed window experiments into graduation review draft
</commit_message>
<xml_diff>
--- a/deliverables/CHUM_THESIS_DRAFT_KO.docx
+++ b/deliverables/CHUM_THESIS_DRAFT_KO.docx
@@ -27,7 +27,7 @@
           <w:color w:val="12202F"/>
           <w:sz w:val="20"/>
         </w:rPr>
-        <w:t>검토용 논문 초안 · 2026-09-21</w:t>
+        <w:t>검토용 논문 초안 · 2026-09-21 작성 / 2026-10-02 후속 결과·범위 보충</w:t>
       </w:r>
     </w:p>
     <w:p>
@@ -1021,16 +1021,13 @@
       </w:r>
     </w:p>
     <w:p>
-      <w:pPr>
-        <w:pStyle w:val="ListNumber"/>
-      </w:pPr>
       <w:r>
         <w:rPr>
           <w:rFonts w:ascii="Malgun Gothic" w:hAnsi="Malgun Gothic" w:eastAsia="Malgun Gothic"/>
           <w:color w:val="12202F"/>
           <w:sz w:val="20"/>
         </w:rPr>
-        <w:t xml:space="preserve">mean ΔAUROC </w:t>
+        <w:t xml:space="preserve">1. mean ΔAUROC </w:t>
       </w:r>
       <w:r>
         <w:rPr>
@@ -1043,16 +1040,13 @@
       </w:r>
     </w:p>
     <w:p>
-      <w:pPr>
-        <w:pStyle w:val="ListNumber"/>
-      </w:pPr>
       <w:r>
         <w:rPr>
           <w:rFonts w:ascii="Malgun Gothic" w:hAnsi="Malgun Gothic" w:eastAsia="Malgun Gothic"/>
           <w:color w:val="12202F"/>
           <w:sz w:val="20"/>
         </w:rPr>
-        <w:t xml:space="preserve">5 seeds 중 </w:t>
+        <w:t xml:space="preserve">2. 5 seeds 중 </w:t>
       </w:r>
       <w:r>
         <w:rPr>
@@ -1073,16 +1067,13 @@
       </w:r>
     </w:p>
     <w:p>
-      <w:pPr>
-        <w:pStyle w:val="ListNumber"/>
-      </w:pPr>
       <w:r>
         <w:rPr>
           <w:rFonts w:ascii="Malgun Gothic" w:hAnsi="Malgun Gothic" w:eastAsia="Malgun Gothic"/>
           <w:color w:val="12202F"/>
           <w:sz w:val="20"/>
         </w:rPr>
-        <w:t xml:space="preserve">최대 절대 pre-fault ΔFPR </w:t>
+        <w:t xml:space="preserve">3. 최대 절대 pre-fault ΔFPR </w:t>
       </w:r>
       <w:r>
         <w:rPr>
@@ -1095,16 +1086,13 @@
       </w:r>
     </w:p>
     <w:p>
-      <w:pPr>
-        <w:pStyle w:val="ListNumber"/>
-      </w:pPr>
       <w:r>
         <w:rPr>
           <w:rFonts w:ascii="Malgun Gothic" w:hAnsi="Malgun Gothic" w:eastAsia="Malgun Gothic"/>
           <w:color w:val="12202F"/>
           <w:sz w:val="20"/>
         </w:rPr>
-        <w:t xml:space="preserve">paired hierarchical seed→run bootstrap 95% CI 하한 </w:t>
+        <w:t xml:space="preserve">4. paired hierarchical seed→run bootstrap 95% CI 하한 </w:t>
       </w:r>
       <w:r>
         <w:rPr>
@@ -1117,29 +1105,23 @@
       </w:r>
     </w:p>
     <w:p>
-      <w:pPr>
-        <w:pStyle w:val="ListNumber"/>
-      </w:pPr>
       <w:r>
         <w:rPr>
           <w:rFonts w:ascii="Malgun Gothic" w:hAnsi="Malgun Gothic" w:eastAsia="Malgun Gothic"/>
           <w:color w:val="12202F"/>
           <w:sz w:val="20"/>
         </w:rPr>
-        <w:t>imputer의 held-out distribution·lag quality 통과</w:t>
+        <w:t>5. imputer의 held-out distribution·lag quality 통과</w:t>
       </w:r>
     </w:p>
     <w:p>
-      <w:pPr>
-        <w:pStyle w:val="ListNumber"/>
-      </w:pPr>
       <w:r>
         <w:rPr>
           <w:rFonts w:ascii="Malgun Gothic" w:hAnsi="Malgun Gothic" w:eastAsia="Malgun Gothic"/>
           <w:color w:val="12202F"/>
           <w:sz w:val="20"/>
         </w:rPr>
-        <w:t>TCN과 Transformer 모두 위 기준 통과</w:t>
+        <w:t>6. TCN과 Transformer 모두 위 기준 통과</w:t>
       </w:r>
     </w:p>
     <w:p>
@@ -1894,68 +1876,53 @@
       </w:r>
     </w:p>
     <w:p>
-      <w:pPr>
-        <w:pStyle w:val="ListNumber"/>
-      </w:pPr>
       <w:r>
         <w:rPr>
           <w:rFonts w:ascii="Malgun Gothic" w:hAnsi="Malgun Gothic" w:eastAsia="Malgun Gothic"/>
           <w:color w:val="12202F"/>
           <w:sz w:val="20"/>
         </w:rPr>
-        <w:t>split을 먼저 확정하고 window를 생성한다.</w:t>
+        <w:t>1. split을 먼저 확정하고 window를 생성한다.</w:t>
       </w:r>
     </w:p>
     <w:p>
-      <w:pPr>
-        <w:pStyle w:val="ListNumber"/>
-      </w:pPr>
       <w:r>
         <w:rPr>
           <w:rFonts w:ascii="Malgun Gothic" w:hAnsi="Malgun Gothic" w:eastAsia="Malgun Gothic"/>
           <w:color w:val="12202F"/>
           <w:sz w:val="20"/>
         </w:rPr>
-        <w:t>scaler와 imputer는 training 정상 데이터에만 fit한다.</w:t>
+        <w:t>2. scaler와 imputer는 training 정상 데이터에만 fit한다.</w:t>
       </w:r>
     </w:p>
     <w:p>
-      <w:pPr>
-        <w:pStyle w:val="ListNumber"/>
-      </w:pPr>
       <w:r>
         <w:rPr>
           <w:rFonts w:ascii="Malgun Gothic" w:hAnsi="Malgun Gothic" w:eastAsia="Malgun Gothic"/>
           <w:color w:val="12202F"/>
           <w:sz w:val="20"/>
         </w:rPr>
-        <w:t>threshold는 validation 정상 score percentile로만 정한다.</w:t>
+        <w:t>3. threshold는 validation 정상 score percentile로만 정한다.</w:t>
       </w:r>
     </w:p>
     <w:p>
-      <w:pPr>
-        <w:pStyle w:val="ListNumber"/>
-      </w:pPr>
       <w:r>
         <w:rPr>
           <w:rFonts w:ascii="Malgun Gothic" w:hAnsi="Malgun Gothic" w:eastAsia="Malgun Gothic"/>
           <w:color w:val="12202F"/>
           <w:sz w:val="20"/>
         </w:rPr>
-        <w:t>각 perturbation condition의 score distribution에 맞춰 validation threshold를 다시 보정한다.</w:t>
+        <w:t>4. 각 perturbation condition의 score distribution에 맞춰 validation threshold를 다시 보정한다.</w:t>
       </w:r>
     </w:p>
     <w:p>
-      <w:pPr>
-        <w:pStyle w:val="ListNumber"/>
-      </w:pPr>
       <w:r>
         <w:rPr>
           <w:rFonts w:ascii="Malgun Gothic" w:hAnsi="Malgun Gothic" w:eastAsia="Malgun Gothic"/>
           <w:color w:val="12202F"/>
           <w:sz w:val="20"/>
         </w:rPr>
-        <w:t>test label은 metric 계산에만 사용하고 training·scaling·imputation·threshold selection에 사용하지 않는다.</w:t>
+        <w:t>5. test label은 metric 계산에만 사용하고 training·scaling·imputation·threshold selection에 사용하지 않는다. 이 구분이 미사용 평가를 뜻하지는 않는다. 기존 TEP test는 후속 방법 개발에서 반복 관찰되었으므로 후속 결과에서는 개발 벤치마크이며 새로운 holdout이 아니다.</w:t>
       </w:r>
     </w:p>
     <w:p>
@@ -3911,7 +3878,7 @@
           <w:color w:val="12202F"/>
           <w:sz w:val="20"/>
         </w:rPr>
-        <w:t>을 식별했다. 모든 fault에서 두 architecture 모두 5/5 seed가 같은 방향이었다.</w:t>
+        <w:t>을 식별했다. 해당 일곱 GAIN fault에서 두 architecture 모두 5/5 seed가 같은 방향이었다.</w:t>
       </w:r>
     </w:p>
     <w:tbl>
@@ -9447,6 +9414,1668 @@
     </w:p>
     <w:p>
       <w:pPr>
+        <w:pStyle w:val="Heading2"/>
+      </w:pPr>
+      <w:r>
+        <w:t>9.5 후속 학습 길이·window 개발 실험 (2026-10-02 보충)</w:t>
+      </w:r>
+    </w:p>
+    <w:p>
+      <w:r>
+        <w:rPr>
+          <w:rFonts w:ascii="Malgun Gothic" w:hAnsi="Malgun Gothic" w:eastAsia="Malgun Gothic"/>
+          <w:color w:val="12202F"/>
+          <w:sz w:val="20"/>
+        </w:rPr>
+        <w:t xml:space="preserve">기존 핵심 결과와 구분하여 seed47의 후속 개발 실험을 보고한다. 1A에서는 정상 validation으로 checkpoint를 선택하며 학습 길이를 늘렸지만 F1 AUROC가 개선되지 않았다. TCN은 0.809665에서 0.807946로, Transformer는 0.807394에서 0.804357로 변했다. 근거는 </w:t>
+      </w:r>
+      <w:r>
+        <w:rPr>
+          <w:rFonts w:ascii="Consolas" w:hAnsi="Consolas" w:eastAsia="Malgun Gothic"/>
+          <w:b/>
+          <w:color w:val="2F6BFF"/>
+          <w:sz w:val="19"/>
+        </w:rPr>
+        <w:t>outputs/chum_harness_20261001/TRAINING_BUDGET_REVIEW.json</w:t>
+      </w:r>
+      <w:r>
+        <w:rPr>
+          <w:rFonts w:ascii="Malgun Gothic" w:hAnsi="Malgun Gothic" w:eastAsia="Malgun Gothic"/>
+          <w:color w:val="12202F"/>
+          <w:sz w:val="20"/>
+        </w:rPr>
+        <w:t>이며, 정상 예측 MSE 개선을 탐지력 개선으로 간주하지 않는다.</w:t>
+      </w:r>
+    </w:p>
+    <w:p>
+      <w:r>
+        <w:rPr>
+          <w:rFonts w:ascii="Malgun Gothic" w:hAnsi="Malgun Gothic" w:eastAsia="Malgun Gothic"/>
+          <w:color w:val="12202F"/>
+          <w:sz w:val="20"/>
+        </w:rPr>
+        <w:t xml:space="preserve">1B는 두 구조 × F0/F1/F0-C × window 20/60/120의 18/18 작업을 완료했다. 아래 F1 여섯 행은 </w:t>
+      </w:r>
+      <w:r>
+        <w:rPr>
+          <w:rFonts w:ascii="Consolas" w:hAnsi="Consolas" w:eastAsia="Malgun Gothic"/>
+          <w:b/>
+          <w:color w:val="2F6BFF"/>
+          <w:sz w:val="19"/>
+        </w:rPr>
+        <w:t>outputs/chum_window_extension_20261001/METRICS.csv</w:t>
+      </w:r>
+      <w:r>
+        <w:rPr>
+          <w:rFonts w:ascii="Malgun Gothic" w:hAnsi="Malgun Gothic" w:eastAsia="Malgun Gothic"/>
+          <w:color w:val="12202F"/>
+          <w:sz w:val="20"/>
+        </w:rPr>
+        <w:t>에서 직접 생성했다. 동일한 기존 test 560 runs를 개발 벤치마크로 사용하고 window 사이의 평가 시작 sample을 121로 맞췄다. 지연 단위는 sample이며, 탐지된 run의 평균 지연과 미탐에 1,401 sample의 패널티를 부여한 평균을 구분한다. 후자는 생존분석의 검열 추정량이 아니다. AP는 non-interpolated average precision이며 분류 정확도가 아니다. 평가 구간의 이상 sample 비율은 약 74.52%이다.</w:t>
+      </w:r>
+    </w:p>
+    <w:tbl>
+      <w:tblPr>
+        <w:tblStyle w:val="TableGrid"/>
+        <w:tblW w:type="auto" w:w="0"/>
+        <w:jc w:val="center"/>
+        <w:tblLayout w:type="fixed"/>
+        <w:tblLook w:firstColumn="1" w:firstRow="1" w:lastColumn="0" w:lastRow="0" w:noHBand="0" w:noVBand="1" w:val="04A0"/>
+      </w:tblPr>
+      <w:tblGrid>
+        <w:gridCol w:w="1176"/>
+        <w:gridCol w:w="1176"/>
+        <w:gridCol w:w="1176"/>
+        <w:gridCol w:w="1176"/>
+        <w:gridCol w:w="1176"/>
+        <w:gridCol w:w="1176"/>
+        <w:gridCol w:w="1176"/>
+        <w:gridCol w:w="1176"/>
+      </w:tblGrid>
+      <w:tr>
+        <w:trPr>
+          <w:tblHeader w:val="true"/>
+          <w:cantSplit/>
+        </w:trPr>
+        <w:tc>
+          <w:tcPr>
+            <w:tcW w:type="dxa" w:w="1166"/>
+            <w:tcMar>
+              <w:top w:w="80" w:type="dxa"/>
+              <w:start w:w="110" w:type="dxa"/>
+              <w:bottom w:w="80" w:type="dxa"/>
+              <w:end w:w="110" w:type="dxa"/>
+            </w:tcMar>
+            <w:vAlign w:val="center"/>
+            <w:shd w:fill="EEF3F8"/>
+          </w:tcPr>
+          <w:p>
+            <w:pPr>
+              <w:keepNext/>
+              <w:spacing w:after="0"/>
+              <w:jc w:val="center"/>
+            </w:pPr>
+            <w:r>
+              <w:rPr>
+                <w:rFonts w:ascii="Malgun Gothic" w:hAnsi="Malgun Gothic" w:eastAsia="Malgun Gothic"/>
+                <w:b/>
+                <w:color w:val="17324D"/>
+                <w:sz w:val="15"/>
+              </w:rPr>
+              <w:t>구조</w:t>
+            </w:r>
+          </w:p>
+        </w:tc>
+        <w:tc>
+          <w:tcPr>
+            <w:tcW w:type="dxa" w:w="1166"/>
+            <w:tcMar>
+              <w:top w:w="80" w:type="dxa"/>
+              <w:start w:w="110" w:type="dxa"/>
+              <w:bottom w:w="80" w:type="dxa"/>
+              <w:end w:w="110" w:type="dxa"/>
+            </w:tcMar>
+            <w:vAlign w:val="center"/>
+            <w:shd w:fill="EEF3F8"/>
+          </w:tcPr>
+          <w:p>
+            <w:pPr>
+              <w:keepNext/>
+              <w:spacing w:after="0"/>
+              <w:jc w:val="center"/>
+            </w:pPr>
+            <w:r>
+              <w:rPr>
+                <w:rFonts w:ascii="Malgun Gothic" w:hAnsi="Malgun Gothic" w:eastAsia="Malgun Gothic"/>
+                <w:b/>
+                <w:color w:val="17324D"/>
+                <w:sz w:val="15"/>
+              </w:rPr>
+              <w:t>Window</w:t>
+            </w:r>
+          </w:p>
+        </w:tc>
+        <w:tc>
+          <w:tcPr>
+            <w:tcW w:type="dxa" w:w="1166"/>
+            <w:tcMar>
+              <w:top w:w="80" w:type="dxa"/>
+              <w:start w:w="110" w:type="dxa"/>
+              <w:bottom w:w="80" w:type="dxa"/>
+              <w:end w:w="110" w:type="dxa"/>
+            </w:tcMar>
+            <w:vAlign w:val="center"/>
+            <w:shd w:fill="EEF3F8"/>
+          </w:tcPr>
+          <w:p>
+            <w:pPr>
+              <w:keepNext/>
+              <w:spacing w:after="0"/>
+              <w:jc w:val="center"/>
+            </w:pPr>
+            <w:r>
+              <w:rPr>
+                <w:rFonts w:ascii="Malgun Gothic" w:hAnsi="Malgun Gothic" w:eastAsia="Malgun Gothic"/>
+                <w:b/>
+                <w:color w:val="17324D"/>
+                <w:sz w:val="15"/>
+              </w:rPr>
+              <w:t>AUROC</w:t>
+            </w:r>
+          </w:p>
+        </w:tc>
+        <w:tc>
+          <w:tcPr>
+            <w:tcW w:type="dxa" w:w="1166"/>
+            <w:tcMar>
+              <w:top w:w="80" w:type="dxa"/>
+              <w:start w:w="110" w:type="dxa"/>
+              <w:bottom w:w="80" w:type="dxa"/>
+              <w:end w:w="110" w:type="dxa"/>
+            </w:tcMar>
+            <w:vAlign w:val="center"/>
+            <w:shd w:fill="EEF3F8"/>
+          </w:tcPr>
+          <w:p>
+            <w:pPr>
+              <w:keepNext/>
+              <w:spacing w:after="0"/>
+              <w:jc w:val="center"/>
+            </w:pPr>
+            <w:r>
+              <w:rPr>
+                <w:rFonts w:ascii="Malgun Gothic" w:hAnsi="Malgun Gothic" w:eastAsia="Malgun Gothic"/>
+                <w:b/>
+                <w:color w:val="17324D"/>
+                <w:sz w:val="15"/>
+              </w:rPr>
+              <w:t>AP (저장 필드 auprc)</w:t>
+            </w:r>
+          </w:p>
+        </w:tc>
+        <w:tc>
+          <w:tcPr>
+            <w:tcW w:type="dxa" w:w="1166"/>
+            <w:tcMar>
+              <w:top w:w="80" w:type="dxa"/>
+              <w:start w:w="110" w:type="dxa"/>
+              <w:bottom w:w="80" w:type="dxa"/>
+              <w:end w:w="110" w:type="dxa"/>
+            </w:tcMar>
+            <w:vAlign w:val="center"/>
+            <w:shd w:fill="EEF3F8"/>
+          </w:tcPr>
+          <w:p>
+            <w:pPr>
+              <w:keepNext/>
+              <w:spacing w:after="0"/>
+              <w:jc w:val="center"/>
+            </w:pPr>
+            <w:r>
+              <w:rPr>
+                <w:rFonts w:ascii="Malgun Gothic" w:hAnsi="Malgun Gothic" w:eastAsia="Malgun Gothic"/>
+                <w:b/>
+                <w:color w:val="17324D"/>
+                <w:sz w:val="15"/>
+              </w:rPr>
+              <w:t>탐지 run 비율</w:t>
+            </w:r>
+          </w:p>
+        </w:tc>
+        <w:tc>
+          <w:tcPr>
+            <w:tcW w:type="dxa" w:w="1166"/>
+            <w:tcMar>
+              <w:top w:w="80" w:type="dxa"/>
+              <w:start w:w="110" w:type="dxa"/>
+              <w:bottom w:w="80" w:type="dxa"/>
+              <w:end w:w="110" w:type="dxa"/>
+            </w:tcMar>
+            <w:vAlign w:val="center"/>
+            <w:shd w:fill="EEF3F8"/>
+          </w:tcPr>
+          <w:p>
+            <w:pPr>
+              <w:keepNext/>
+              <w:spacing w:after="0"/>
+              <w:jc w:val="center"/>
+            </w:pPr>
+            <w:r>
+              <w:rPr>
+                <w:rFonts w:ascii="Malgun Gothic" w:hAnsi="Malgun Gothic" w:eastAsia="Malgun Gothic"/>
+                <w:b/>
+                <w:color w:val="17324D"/>
+                <w:sz w:val="15"/>
+              </w:rPr>
+              <w:t>탐지된 run 지연</w:t>
+            </w:r>
+          </w:p>
+        </w:tc>
+        <w:tc>
+          <w:tcPr>
+            <w:tcW w:type="dxa" w:w="1166"/>
+            <w:tcMar>
+              <w:top w:w="80" w:type="dxa"/>
+              <w:start w:w="110" w:type="dxa"/>
+              <w:bottom w:w="80" w:type="dxa"/>
+              <w:end w:w="110" w:type="dxa"/>
+            </w:tcMar>
+            <w:vAlign w:val="center"/>
+            <w:shd w:fill="EEF3F8"/>
+          </w:tcPr>
+          <w:p>
+            <w:pPr>
+              <w:keepNext/>
+              <w:spacing w:after="0"/>
+              <w:jc w:val="center"/>
+            </w:pPr>
+            <w:r>
+              <w:rPr>
+                <w:rFonts w:ascii="Malgun Gothic" w:hAnsi="Malgun Gothic" w:eastAsia="Malgun Gothic"/>
+                <w:b/>
+                <w:color w:val="17324D"/>
+                <w:sz w:val="15"/>
+              </w:rPr>
+              <w:t>미탐 패널티 포함 평균 지연</w:t>
+            </w:r>
+          </w:p>
+        </w:tc>
+        <w:tc>
+          <w:tcPr>
+            <w:tcW w:type="dxa" w:w="1166"/>
+            <w:tcMar>
+              <w:top w:w="80" w:type="dxa"/>
+              <w:start w:w="110" w:type="dxa"/>
+              <w:bottom w:w="80" w:type="dxa"/>
+              <w:end w:w="110" w:type="dxa"/>
+            </w:tcMar>
+            <w:vAlign w:val="center"/>
+            <w:shd w:fill="EEF3F8"/>
+          </w:tcPr>
+          <w:p>
+            <w:pPr>
+              <w:keepNext/>
+              <w:spacing w:after="0"/>
+              <w:jc w:val="center"/>
+            </w:pPr>
+            <w:r>
+              <w:rPr>
+                <w:rFonts w:ascii="Malgun Gothic" w:hAnsi="Malgun Gothic" w:eastAsia="Malgun Gothic"/>
+                <w:b/>
+                <w:color w:val="17324D"/>
+                <w:sz w:val="15"/>
+              </w:rPr>
+              <w:t>고장 이전 sample FPR</w:t>
+            </w:r>
+          </w:p>
+        </w:tc>
+      </w:tr>
+      <w:tr>
+        <w:trPr>
+          <w:cantSplit/>
+        </w:trPr>
+        <w:tc>
+          <w:tcPr>
+            <w:tcW w:type="dxa" w:w="1166"/>
+            <w:tcMar>
+              <w:top w:w="80" w:type="dxa"/>
+              <w:start w:w="110" w:type="dxa"/>
+              <w:bottom w:w="80" w:type="dxa"/>
+              <w:end w:w="110" w:type="dxa"/>
+            </w:tcMar>
+            <w:vAlign w:val="center"/>
+          </w:tcPr>
+          <w:p>
+            <w:pPr>
+              <w:keepNext/>
+              <w:spacing w:after="0"/>
+              <w:jc w:val="left"/>
+            </w:pPr>
+            <w:r>
+              <w:rPr>
+                <w:rFonts w:ascii="Malgun Gothic" w:hAnsi="Malgun Gothic" w:eastAsia="Malgun Gothic"/>
+                <w:color w:val="12202F"/>
+                <w:sz w:val="15"/>
+              </w:rPr>
+              <w:t>tcn</w:t>
+            </w:r>
+          </w:p>
+        </w:tc>
+        <w:tc>
+          <w:tcPr>
+            <w:tcW w:type="dxa" w:w="1166"/>
+            <w:tcMar>
+              <w:top w:w="80" w:type="dxa"/>
+              <w:start w:w="110" w:type="dxa"/>
+              <w:bottom w:w="80" w:type="dxa"/>
+              <w:end w:w="110" w:type="dxa"/>
+            </w:tcMar>
+            <w:vAlign w:val="center"/>
+          </w:tcPr>
+          <w:p>
+            <w:pPr>
+              <w:keepNext/>
+              <w:spacing w:after="0"/>
+              <w:jc w:val="center"/>
+            </w:pPr>
+            <w:r>
+              <w:rPr>
+                <w:rFonts w:ascii="Malgun Gothic" w:hAnsi="Malgun Gothic" w:eastAsia="Malgun Gothic"/>
+                <w:color w:val="12202F"/>
+                <w:sz w:val="15"/>
+              </w:rPr>
+              <w:t>20</w:t>
+            </w:r>
+          </w:p>
+        </w:tc>
+        <w:tc>
+          <w:tcPr>
+            <w:tcW w:type="dxa" w:w="1166"/>
+            <w:tcMar>
+              <w:top w:w="80" w:type="dxa"/>
+              <w:start w:w="110" w:type="dxa"/>
+              <w:bottom w:w="80" w:type="dxa"/>
+              <w:end w:w="110" w:type="dxa"/>
+            </w:tcMar>
+            <w:vAlign w:val="center"/>
+          </w:tcPr>
+          <w:p>
+            <w:pPr>
+              <w:keepNext/>
+              <w:spacing w:after="0"/>
+              <w:jc w:val="center"/>
+            </w:pPr>
+            <w:r>
+              <w:rPr>
+                <w:rFonts w:ascii="Malgun Gothic" w:hAnsi="Malgun Gothic" w:eastAsia="Malgun Gothic"/>
+                <w:color w:val="12202F"/>
+                <w:sz w:val="15"/>
+              </w:rPr>
+              <w:t>0.823312</w:t>
+            </w:r>
+          </w:p>
+        </w:tc>
+        <w:tc>
+          <w:tcPr>
+            <w:tcW w:type="dxa" w:w="1166"/>
+            <w:tcMar>
+              <w:top w:w="80" w:type="dxa"/>
+              <w:start w:w="110" w:type="dxa"/>
+              <w:bottom w:w="80" w:type="dxa"/>
+              <w:end w:w="110" w:type="dxa"/>
+            </w:tcMar>
+            <w:vAlign w:val="center"/>
+          </w:tcPr>
+          <w:p>
+            <w:pPr>
+              <w:keepNext/>
+              <w:spacing w:after="0"/>
+              <w:jc w:val="center"/>
+            </w:pPr>
+            <w:r>
+              <w:rPr>
+                <w:rFonts w:ascii="Malgun Gothic" w:hAnsi="Malgun Gothic" w:eastAsia="Malgun Gothic"/>
+                <w:color w:val="12202F"/>
+                <w:sz w:val="15"/>
+              </w:rPr>
+              <w:t>0.942033</w:t>
+            </w:r>
+          </w:p>
+        </w:tc>
+        <w:tc>
+          <w:tcPr>
+            <w:tcW w:type="dxa" w:w="1166"/>
+            <w:tcMar>
+              <w:top w:w="80" w:type="dxa"/>
+              <w:start w:w="110" w:type="dxa"/>
+              <w:bottom w:w="80" w:type="dxa"/>
+              <w:end w:w="110" w:type="dxa"/>
+            </w:tcMar>
+            <w:vAlign w:val="center"/>
+          </w:tcPr>
+          <w:p>
+            <w:pPr>
+              <w:keepNext/>
+              <w:spacing w:after="0"/>
+              <w:jc w:val="center"/>
+            </w:pPr>
+            <w:r>
+              <w:rPr>
+                <w:rFonts w:ascii="Malgun Gothic" w:hAnsi="Malgun Gothic" w:eastAsia="Malgun Gothic"/>
+                <w:color w:val="12202F"/>
+                <w:sz w:val="15"/>
+              </w:rPr>
+              <w:t>0.687500</w:t>
+            </w:r>
+          </w:p>
+        </w:tc>
+        <w:tc>
+          <w:tcPr>
+            <w:tcW w:type="dxa" w:w="1166"/>
+            <w:tcMar>
+              <w:top w:w="80" w:type="dxa"/>
+              <w:start w:w="110" w:type="dxa"/>
+              <w:bottom w:w="80" w:type="dxa"/>
+              <w:end w:w="110" w:type="dxa"/>
+            </w:tcMar>
+            <w:vAlign w:val="center"/>
+          </w:tcPr>
+          <w:p>
+            <w:pPr>
+              <w:keepNext/>
+              <w:spacing w:after="0"/>
+              <w:jc w:val="center"/>
+            </w:pPr>
+            <w:r>
+              <w:rPr>
+                <w:rFonts w:ascii="Malgun Gothic" w:hAnsi="Malgun Gothic" w:eastAsia="Malgun Gothic"/>
+                <w:color w:val="12202F"/>
+                <w:sz w:val="15"/>
+              </w:rPr>
+              <w:t>32.584416</w:t>
+            </w:r>
+          </w:p>
+        </w:tc>
+        <w:tc>
+          <w:tcPr>
+            <w:tcW w:type="dxa" w:w="1166"/>
+            <w:tcMar>
+              <w:top w:w="80" w:type="dxa"/>
+              <w:start w:w="110" w:type="dxa"/>
+              <w:bottom w:w="80" w:type="dxa"/>
+              <w:end w:w="110" w:type="dxa"/>
+            </w:tcMar>
+            <w:vAlign w:val="center"/>
+          </w:tcPr>
+          <w:p>
+            <w:pPr>
+              <w:keepNext/>
+              <w:spacing w:after="0"/>
+              <w:jc w:val="center"/>
+            </w:pPr>
+            <w:r>
+              <w:rPr>
+                <w:rFonts w:ascii="Malgun Gothic" w:hAnsi="Malgun Gothic" w:eastAsia="Malgun Gothic"/>
+                <w:color w:val="12202F"/>
+                <w:sz w:val="15"/>
+              </w:rPr>
+              <w:t>460.214286</w:t>
+            </w:r>
+          </w:p>
+        </w:tc>
+        <w:tc>
+          <w:tcPr>
+            <w:tcW w:type="dxa" w:w="1166"/>
+            <w:tcMar>
+              <w:top w:w="80" w:type="dxa"/>
+              <w:start w:w="110" w:type="dxa"/>
+              <w:bottom w:w="80" w:type="dxa"/>
+              <w:end w:w="110" w:type="dxa"/>
+            </w:tcMar>
+            <w:vAlign w:val="center"/>
+          </w:tcPr>
+          <w:p>
+            <w:pPr>
+              <w:keepNext/>
+              <w:spacing w:after="0"/>
+              <w:jc w:val="center"/>
+            </w:pPr>
+            <w:r>
+              <w:rPr>
+                <w:rFonts w:ascii="Malgun Gothic" w:hAnsi="Malgun Gothic" w:eastAsia="Malgun Gothic"/>
+                <w:color w:val="12202F"/>
+                <w:sz w:val="15"/>
+              </w:rPr>
+              <w:t>0.009875</w:t>
+            </w:r>
+          </w:p>
+        </w:tc>
+      </w:tr>
+      <w:tr>
+        <w:trPr>
+          <w:cantSplit/>
+        </w:trPr>
+        <w:tc>
+          <w:tcPr>
+            <w:tcW w:type="dxa" w:w="1166"/>
+            <w:tcMar>
+              <w:top w:w="80" w:type="dxa"/>
+              <w:start w:w="110" w:type="dxa"/>
+              <w:bottom w:w="80" w:type="dxa"/>
+              <w:end w:w="110" w:type="dxa"/>
+            </w:tcMar>
+            <w:vAlign w:val="center"/>
+          </w:tcPr>
+          <w:p>
+            <w:pPr>
+              <w:keepNext/>
+              <w:spacing w:after="0"/>
+              <w:jc w:val="left"/>
+            </w:pPr>
+            <w:r>
+              <w:rPr>
+                <w:rFonts w:ascii="Malgun Gothic" w:hAnsi="Malgun Gothic" w:eastAsia="Malgun Gothic"/>
+                <w:color w:val="12202F"/>
+                <w:sz w:val="15"/>
+              </w:rPr>
+              <w:t>tcn</w:t>
+            </w:r>
+          </w:p>
+        </w:tc>
+        <w:tc>
+          <w:tcPr>
+            <w:tcW w:type="dxa" w:w="1166"/>
+            <w:tcMar>
+              <w:top w:w="80" w:type="dxa"/>
+              <w:start w:w="110" w:type="dxa"/>
+              <w:bottom w:w="80" w:type="dxa"/>
+              <w:end w:w="110" w:type="dxa"/>
+            </w:tcMar>
+            <w:vAlign w:val="center"/>
+          </w:tcPr>
+          <w:p>
+            <w:pPr>
+              <w:keepNext/>
+              <w:spacing w:after="0"/>
+              <w:jc w:val="center"/>
+            </w:pPr>
+            <w:r>
+              <w:rPr>
+                <w:rFonts w:ascii="Malgun Gothic" w:hAnsi="Malgun Gothic" w:eastAsia="Malgun Gothic"/>
+                <w:color w:val="12202F"/>
+                <w:sz w:val="15"/>
+              </w:rPr>
+              <w:t>60</w:t>
+            </w:r>
+          </w:p>
+        </w:tc>
+        <w:tc>
+          <w:tcPr>
+            <w:tcW w:type="dxa" w:w="1166"/>
+            <w:tcMar>
+              <w:top w:w="80" w:type="dxa"/>
+              <w:start w:w="110" w:type="dxa"/>
+              <w:bottom w:w="80" w:type="dxa"/>
+              <w:end w:w="110" w:type="dxa"/>
+            </w:tcMar>
+            <w:vAlign w:val="center"/>
+          </w:tcPr>
+          <w:p>
+            <w:pPr>
+              <w:keepNext/>
+              <w:spacing w:after="0"/>
+              <w:jc w:val="center"/>
+            </w:pPr>
+            <w:r>
+              <w:rPr>
+                <w:rFonts w:ascii="Malgun Gothic" w:hAnsi="Malgun Gothic" w:eastAsia="Malgun Gothic"/>
+                <w:color w:val="12202F"/>
+                <w:sz w:val="15"/>
+              </w:rPr>
+              <w:t>0.821922</w:t>
+            </w:r>
+          </w:p>
+        </w:tc>
+        <w:tc>
+          <w:tcPr>
+            <w:tcW w:type="dxa" w:w="1166"/>
+            <w:tcMar>
+              <w:top w:w="80" w:type="dxa"/>
+              <w:start w:w="110" w:type="dxa"/>
+              <w:bottom w:w="80" w:type="dxa"/>
+              <w:end w:w="110" w:type="dxa"/>
+            </w:tcMar>
+            <w:vAlign w:val="center"/>
+          </w:tcPr>
+          <w:p>
+            <w:pPr>
+              <w:keepNext/>
+              <w:spacing w:after="0"/>
+              <w:jc w:val="center"/>
+            </w:pPr>
+            <w:r>
+              <w:rPr>
+                <w:rFonts w:ascii="Malgun Gothic" w:hAnsi="Malgun Gothic" w:eastAsia="Malgun Gothic"/>
+                <w:color w:val="12202F"/>
+                <w:sz w:val="15"/>
+              </w:rPr>
+              <w:t>0.941448</w:t>
+            </w:r>
+          </w:p>
+        </w:tc>
+        <w:tc>
+          <w:tcPr>
+            <w:tcW w:type="dxa" w:w="1166"/>
+            <w:tcMar>
+              <w:top w:w="80" w:type="dxa"/>
+              <w:start w:w="110" w:type="dxa"/>
+              <w:bottom w:w="80" w:type="dxa"/>
+              <w:end w:w="110" w:type="dxa"/>
+            </w:tcMar>
+            <w:vAlign w:val="center"/>
+          </w:tcPr>
+          <w:p>
+            <w:pPr>
+              <w:keepNext/>
+              <w:spacing w:after="0"/>
+              <w:jc w:val="center"/>
+            </w:pPr>
+            <w:r>
+              <w:rPr>
+                <w:rFonts w:ascii="Malgun Gothic" w:hAnsi="Malgun Gothic" w:eastAsia="Malgun Gothic"/>
+                <w:color w:val="12202F"/>
+                <w:sz w:val="15"/>
+              </w:rPr>
+              <w:t>0.680357</w:t>
+            </w:r>
+          </w:p>
+        </w:tc>
+        <w:tc>
+          <w:tcPr>
+            <w:tcW w:type="dxa" w:w="1166"/>
+            <w:tcMar>
+              <w:top w:w="80" w:type="dxa"/>
+              <w:start w:w="110" w:type="dxa"/>
+              <w:bottom w:w="80" w:type="dxa"/>
+              <w:end w:w="110" w:type="dxa"/>
+            </w:tcMar>
+            <w:vAlign w:val="center"/>
+          </w:tcPr>
+          <w:p>
+            <w:pPr>
+              <w:keepNext/>
+              <w:spacing w:after="0"/>
+              <w:jc w:val="center"/>
+            </w:pPr>
+            <w:r>
+              <w:rPr>
+                <w:rFonts w:ascii="Malgun Gothic" w:hAnsi="Malgun Gothic" w:eastAsia="Malgun Gothic"/>
+                <w:color w:val="12202F"/>
+                <w:sz w:val="15"/>
+              </w:rPr>
+              <w:t>23.467192</w:t>
+            </w:r>
+          </w:p>
+        </w:tc>
+        <w:tc>
+          <w:tcPr>
+            <w:tcW w:type="dxa" w:w="1166"/>
+            <w:tcMar>
+              <w:top w:w="80" w:type="dxa"/>
+              <w:start w:w="110" w:type="dxa"/>
+              <w:bottom w:w="80" w:type="dxa"/>
+              <w:end w:w="110" w:type="dxa"/>
+            </w:tcMar>
+            <w:vAlign w:val="center"/>
+          </w:tcPr>
+          <w:p>
+            <w:pPr>
+              <w:keepNext/>
+              <w:spacing w:after="0"/>
+              <w:jc w:val="center"/>
+            </w:pPr>
+            <w:r>
+              <w:rPr>
+                <w:rFonts w:ascii="Malgun Gothic" w:hAnsi="Malgun Gothic" w:eastAsia="Malgun Gothic"/>
+                <w:color w:val="12202F"/>
+                <w:sz w:val="15"/>
+              </w:rPr>
+              <w:t>463.785714</w:t>
+            </w:r>
+          </w:p>
+        </w:tc>
+        <w:tc>
+          <w:tcPr>
+            <w:tcW w:type="dxa" w:w="1166"/>
+            <w:tcMar>
+              <w:top w:w="80" w:type="dxa"/>
+              <w:start w:w="110" w:type="dxa"/>
+              <w:bottom w:w="80" w:type="dxa"/>
+              <w:end w:w="110" w:type="dxa"/>
+            </w:tcMar>
+            <w:vAlign w:val="center"/>
+          </w:tcPr>
+          <w:p>
+            <w:pPr>
+              <w:keepNext/>
+              <w:spacing w:after="0"/>
+              <w:jc w:val="center"/>
+            </w:pPr>
+            <w:r>
+              <w:rPr>
+                <w:rFonts w:ascii="Malgun Gothic" w:hAnsi="Malgun Gothic" w:eastAsia="Malgun Gothic"/>
+                <w:color w:val="12202F"/>
+                <w:sz w:val="15"/>
+              </w:rPr>
+              <w:t>0.010163</w:t>
+            </w:r>
+          </w:p>
+        </w:tc>
+      </w:tr>
+      <w:tr>
+        <w:trPr>
+          <w:cantSplit/>
+        </w:trPr>
+        <w:tc>
+          <w:tcPr>
+            <w:tcW w:type="dxa" w:w="1166"/>
+            <w:tcMar>
+              <w:top w:w="80" w:type="dxa"/>
+              <w:start w:w="110" w:type="dxa"/>
+              <w:bottom w:w="80" w:type="dxa"/>
+              <w:end w:w="110" w:type="dxa"/>
+            </w:tcMar>
+            <w:vAlign w:val="center"/>
+          </w:tcPr>
+          <w:p>
+            <w:pPr>
+              <w:keepNext/>
+              <w:spacing w:after="0"/>
+              <w:jc w:val="left"/>
+            </w:pPr>
+            <w:r>
+              <w:rPr>
+                <w:rFonts w:ascii="Malgun Gothic" w:hAnsi="Malgun Gothic" w:eastAsia="Malgun Gothic"/>
+                <w:color w:val="12202F"/>
+                <w:sz w:val="15"/>
+              </w:rPr>
+              <w:t>tcn</w:t>
+            </w:r>
+          </w:p>
+        </w:tc>
+        <w:tc>
+          <w:tcPr>
+            <w:tcW w:type="dxa" w:w="1166"/>
+            <w:tcMar>
+              <w:top w:w="80" w:type="dxa"/>
+              <w:start w:w="110" w:type="dxa"/>
+              <w:bottom w:w="80" w:type="dxa"/>
+              <w:end w:w="110" w:type="dxa"/>
+            </w:tcMar>
+            <w:vAlign w:val="center"/>
+          </w:tcPr>
+          <w:p>
+            <w:pPr>
+              <w:keepNext/>
+              <w:spacing w:after="0"/>
+              <w:jc w:val="center"/>
+            </w:pPr>
+            <w:r>
+              <w:rPr>
+                <w:rFonts w:ascii="Malgun Gothic" w:hAnsi="Malgun Gothic" w:eastAsia="Malgun Gothic"/>
+                <w:color w:val="12202F"/>
+                <w:sz w:val="15"/>
+              </w:rPr>
+              <w:t>120</w:t>
+            </w:r>
+          </w:p>
+        </w:tc>
+        <w:tc>
+          <w:tcPr>
+            <w:tcW w:type="dxa" w:w="1166"/>
+            <w:tcMar>
+              <w:top w:w="80" w:type="dxa"/>
+              <w:start w:w="110" w:type="dxa"/>
+              <w:bottom w:w="80" w:type="dxa"/>
+              <w:end w:w="110" w:type="dxa"/>
+            </w:tcMar>
+            <w:vAlign w:val="center"/>
+          </w:tcPr>
+          <w:p>
+            <w:pPr>
+              <w:keepNext/>
+              <w:spacing w:after="0"/>
+              <w:jc w:val="center"/>
+            </w:pPr>
+            <w:r>
+              <w:rPr>
+                <w:rFonts w:ascii="Malgun Gothic" w:hAnsi="Malgun Gothic" w:eastAsia="Malgun Gothic"/>
+                <w:color w:val="12202F"/>
+                <w:sz w:val="15"/>
+              </w:rPr>
+              <w:t>0.821554</w:t>
+            </w:r>
+          </w:p>
+        </w:tc>
+        <w:tc>
+          <w:tcPr>
+            <w:tcW w:type="dxa" w:w="1166"/>
+            <w:tcMar>
+              <w:top w:w="80" w:type="dxa"/>
+              <w:start w:w="110" w:type="dxa"/>
+              <w:bottom w:w="80" w:type="dxa"/>
+              <w:end w:w="110" w:type="dxa"/>
+            </w:tcMar>
+            <w:vAlign w:val="center"/>
+          </w:tcPr>
+          <w:p>
+            <w:pPr>
+              <w:keepNext/>
+              <w:spacing w:after="0"/>
+              <w:jc w:val="center"/>
+            </w:pPr>
+            <w:r>
+              <w:rPr>
+                <w:rFonts w:ascii="Malgun Gothic" w:hAnsi="Malgun Gothic" w:eastAsia="Malgun Gothic"/>
+                <w:color w:val="12202F"/>
+                <w:sz w:val="15"/>
+              </w:rPr>
+              <w:t>0.941471</w:t>
+            </w:r>
+          </w:p>
+        </w:tc>
+        <w:tc>
+          <w:tcPr>
+            <w:tcW w:type="dxa" w:w="1166"/>
+            <w:tcMar>
+              <w:top w:w="80" w:type="dxa"/>
+              <w:start w:w="110" w:type="dxa"/>
+              <w:bottom w:w="80" w:type="dxa"/>
+              <w:end w:w="110" w:type="dxa"/>
+            </w:tcMar>
+            <w:vAlign w:val="center"/>
+          </w:tcPr>
+          <w:p>
+            <w:pPr>
+              <w:keepNext/>
+              <w:spacing w:after="0"/>
+              <w:jc w:val="center"/>
+            </w:pPr>
+            <w:r>
+              <w:rPr>
+                <w:rFonts w:ascii="Malgun Gothic" w:hAnsi="Malgun Gothic" w:eastAsia="Malgun Gothic"/>
+                <w:color w:val="12202F"/>
+                <w:sz w:val="15"/>
+              </w:rPr>
+              <w:t>0.682143</w:t>
+            </w:r>
+          </w:p>
+        </w:tc>
+        <w:tc>
+          <w:tcPr>
+            <w:tcW w:type="dxa" w:w="1166"/>
+            <w:tcMar>
+              <w:top w:w="80" w:type="dxa"/>
+              <w:start w:w="110" w:type="dxa"/>
+              <w:bottom w:w="80" w:type="dxa"/>
+              <w:end w:w="110" w:type="dxa"/>
+            </w:tcMar>
+            <w:vAlign w:val="center"/>
+          </w:tcPr>
+          <w:p>
+            <w:pPr>
+              <w:keepNext/>
+              <w:spacing w:after="0"/>
+              <w:jc w:val="center"/>
+            </w:pPr>
+            <w:r>
+              <w:rPr>
+                <w:rFonts w:ascii="Malgun Gothic" w:hAnsi="Malgun Gothic" w:eastAsia="Malgun Gothic"/>
+                <w:color w:val="12202F"/>
+                <w:sz w:val="15"/>
+              </w:rPr>
+              <w:t>27.204188</w:t>
+            </w:r>
+          </w:p>
+        </w:tc>
+        <w:tc>
+          <w:tcPr>
+            <w:tcW w:type="dxa" w:w="1166"/>
+            <w:tcMar>
+              <w:top w:w="80" w:type="dxa"/>
+              <w:start w:w="110" w:type="dxa"/>
+              <w:bottom w:w="80" w:type="dxa"/>
+              <w:end w:w="110" w:type="dxa"/>
+            </w:tcMar>
+            <w:vAlign w:val="center"/>
+          </w:tcPr>
+          <w:p>
+            <w:pPr>
+              <w:keepNext/>
+              <w:spacing w:after="0"/>
+              <w:jc w:val="center"/>
+            </w:pPr>
+            <w:r>
+              <w:rPr>
+                <w:rFonts w:ascii="Malgun Gothic" w:hAnsi="Malgun Gothic" w:eastAsia="Malgun Gothic"/>
+                <w:color w:val="12202F"/>
+                <w:sz w:val="15"/>
+              </w:rPr>
+              <w:t>463.875000</w:t>
+            </w:r>
+          </w:p>
+        </w:tc>
+        <w:tc>
+          <w:tcPr>
+            <w:tcW w:type="dxa" w:w="1166"/>
+            <w:tcMar>
+              <w:top w:w="80" w:type="dxa"/>
+              <w:start w:w="110" w:type="dxa"/>
+              <w:bottom w:w="80" w:type="dxa"/>
+              <w:end w:w="110" w:type="dxa"/>
+            </w:tcMar>
+            <w:vAlign w:val="center"/>
+          </w:tcPr>
+          <w:p>
+            <w:pPr>
+              <w:keepNext/>
+              <w:spacing w:after="0"/>
+              <w:jc w:val="center"/>
+            </w:pPr>
+            <w:r>
+              <w:rPr>
+                <w:rFonts w:ascii="Malgun Gothic" w:hAnsi="Malgun Gothic" w:eastAsia="Malgun Gothic"/>
+                <w:color w:val="12202F"/>
+                <w:sz w:val="15"/>
+              </w:rPr>
+              <w:t>0.010192</w:t>
+            </w:r>
+          </w:p>
+        </w:tc>
+      </w:tr>
+      <w:tr>
+        <w:trPr>
+          <w:cantSplit/>
+        </w:trPr>
+        <w:tc>
+          <w:tcPr>
+            <w:tcW w:type="dxa" w:w="1166"/>
+            <w:tcMar>
+              <w:top w:w="80" w:type="dxa"/>
+              <w:start w:w="110" w:type="dxa"/>
+              <w:bottom w:w="80" w:type="dxa"/>
+              <w:end w:w="110" w:type="dxa"/>
+            </w:tcMar>
+            <w:vAlign w:val="center"/>
+          </w:tcPr>
+          <w:p>
+            <w:pPr>
+              <w:keepNext/>
+              <w:spacing w:after="0"/>
+              <w:jc w:val="left"/>
+            </w:pPr>
+            <w:r>
+              <w:rPr>
+                <w:rFonts w:ascii="Malgun Gothic" w:hAnsi="Malgun Gothic" w:eastAsia="Malgun Gothic"/>
+                <w:color w:val="12202F"/>
+                <w:sz w:val="15"/>
+              </w:rPr>
+              <w:t>transformer</w:t>
+            </w:r>
+          </w:p>
+        </w:tc>
+        <w:tc>
+          <w:tcPr>
+            <w:tcW w:type="dxa" w:w="1166"/>
+            <w:tcMar>
+              <w:top w:w="80" w:type="dxa"/>
+              <w:start w:w="110" w:type="dxa"/>
+              <w:bottom w:w="80" w:type="dxa"/>
+              <w:end w:w="110" w:type="dxa"/>
+            </w:tcMar>
+            <w:vAlign w:val="center"/>
+          </w:tcPr>
+          <w:p>
+            <w:pPr>
+              <w:keepNext/>
+              <w:spacing w:after="0"/>
+              <w:jc w:val="center"/>
+            </w:pPr>
+            <w:r>
+              <w:rPr>
+                <w:rFonts w:ascii="Malgun Gothic" w:hAnsi="Malgun Gothic" w:eastAsia="Malgun Gothic"/>
+                <w:color w:val="12202F"/>
+                <w:sz w:val="15"/>
+              </w:rPr>
+              <w:t>20</w:t>
+            </w:r>
+          </w:p>
+        </w:tc>
+        <w:tc>
+          <w:tcPr>
+            <w:tcW w:type="dxa" w:w="1166"/>
+            <w:tcMar>
+              <w:top w:w="80" w:type="dxa"/>
+              <w:start w:w="110" w:type="dxa"/>
+              <w:bottom w:w="80" w:type="dxa"/>
+              <w:end w:w="110" w:type="dxa"/>
+            </w:tcMar>
+            <w:vAlign w:val="center"/>
+          </w:tcPr>
+          <w:p>
+            <w:pPr>
+              <w:keepNext/>
+              <w:spacing w:after="0"/>
+              <w:jc w:val="center"/>
+            </w:pPr>
+            <w:r>
+              <w:rPr>
+                <w:rFonts w:ascii="Malgun Gothic" w:hAnsi="Malgun Gothic" w:eastAsia="Malgun Gothic"/>
+                <w:color w:val="12202F"/>
+                <w:sz w:val="15"/>
+              </w:rPr>
+              <w:t>0.806122</w:t>
+            </w:r>
+          </w:p>
+        </w:tc>
+        <w:tc>
+          <w:tcPr>
+            <w:tcW w:type="dxa" w:w="1166"/>
+            <w:tcMar>
+              <w:top w:w="80" w:type="dxa"/>
+              <w:start w:w="110" w:type="dxa"/>
+              <w:bottom w:w="80" w:type="dxa"/>
+              <w:end w:w="110" w:type="dxa"/>
+            </w:tcMar>
+            <w:vAlign w:val="center"/>
+          </w:tcPr>
+          <w:p>
+            <w:pPr>
+              <w:keepNext/>
+              <w:spacing w:after="0"/>
+              <w:jc w:val="center"/>
+            </w:pPr>
+            <w:r>
+              <w:rPr>
+                <w:rFonts w:ascii="Malgun Gothic" w:hAnsi="Malgun Gothic" w:eastAsia="Malgun Gothic"/>
+                <w:color w:val="12202F"/>
+                <w:sz w:val="15"/>
+              </w:rPr>
+              <w:t>0.935994</w:t>
+            </w:r>
+          </w:p>
+        </w:tc>
+        <w:tc>
+          <w:tcPr>
+            <w:tcW w:type="dxa" w:w="1166"/>
+            <w:tcMar>
+              <w:top w:w="80" w:type="dxa"/>
+              <w:start w:w="110" w:type="dxa"/>
+              <w:bottom w:w="80" w:type="dxa"/>
+              <w:end w:w="110" w:type="dxa"/>
+            </w:tcMar>
+            <w:vAlign w:val="center"/>
+          </w:tcPr>
+          <w:p>
+            <w:pPr>
+              <w:keepNext/>
+              <w:spacing w:after="0"/>
+              <w:jc w:val="center"/>
+            </w:pPr>
+            <w:r>
+              <w:rPr>
+                <w:rFonts w:ascii="Malgun Gothic" w:hAnsi="Malgun Gothic" w:eastAsia="Malgun Gothic"/>
+                <w:color w:val="12202F"/>
+                <w:sz w:val="15"/>
+              </w:rPr>
+              <w:t>0.678571</w:t>
+            </w:r>
+          </w:p>
+        </w:tc>
+        <w:tc>
+          <w:tcPr>
+            <w:tcW w:type="dxa" w:w="1166"/>
+            <w:tcMar>
+              <w:top w:w="80" w:type="dxa"/>
+              <w:start w:w="110" w:type="dxa"/>
+              <w:bottom w:w="80" w:type="dxa"/>
+              <w:end w:w="110" w:type="dxa"/>
+            </w:tcMar>
+            <w:vAlign w:val="center"/>
+          </w:tcPr>
+          <w:p>
+            <w:pPr>
+              <w:keepNext/>
+              <w:spacing w:after="0"/>
+              <w:jc w:val="center"/>
+            </w:pPr>
+            <w:r>
+              <w:rPr>
+                <w:rFonts w:ascii="Malgun Gothic" w:hAnsi="Malgun Gothic" w:eastAsia="Malgun Gothic"/>
+                <w:color w:val="12202F"/>
+                <w:sz w:val="15"/>
+              </w:rPr>
+              <w:t>24.084211</w:t>
+            </w:r>
+          </w:p>
+        </w:tc>
+        <w:tc>
+          <w:tcPr>
+            <w:tcW w:type="dxa" w:w="1166"/>
+            <w:tcMar>
+              <w:top w:w="80" w:type="dxa"/>
+              <w:start w:w="110" w:type="dxa"/>
+              <w:bottom w:w="80" w:type="dxa"/>
+              <w:end w:w="110" w:type="dxa"/>
+            </w:tcMar>
+            <w:vAlign w:val="center"/>
+          </w:tcPr>
+          <w:p>
+            <w:pPr>
+              <w:keepNext/>
+              <w:spacing w:after="0"/>
+              <w:jc w:val="center"/>
+            </w:pPr>
+            <w:r>
+              <w:rPr>
+                <w:rFonts w:ascii="Malgun Gothic" w:hAnsi="Malgun Gothic" w:eastAsia="Malgun Gothic"/>
+                <w:color w:val="12202F"/>
+                <w:sz w:val="15"/>
+              </w:rPr>
+              <w:t>466.664286</w:t>
+            </w:r>
+          </w:p>
+        </w:tc>
+        <w:tc>
+          <w:tcPr>
+            <w:tcW w:type="dxa" w:w="1166"/>
+            <w:tcMar>
+              <w:top w:w="80" w:type="dxa"/>
+              <w:start w:w="110" w:type="dxa"/>
+              <w:bottom w:w="80" w:type="dxa"/>
+              <w:end w:w="110" w:type="dxa"/>
+            </w:tcMar>
+            <w:vAlign w:val="center"/>
+          </w:tcPr>
+          <w:p>
+            <w:pPr>
+              <w:keepNext/>
+              <w:spacing w:after="0"/>
+              <w:jc w:val="center"/>
+            </w:pPr>
+            <w:r>
+              <w:rPr>
+                <w:rFonts w:ascii="Malgun Gothic" w:hAnsi="Malgun Gothic" w:eastAsia="Malgun Gothic"/>
+                <w:color w:val="12202F"/>
+                <w:sz w:val="15"/>
+              </w:rPr>
+              <w:t>0.009972</w:t>
+            </w:r>
+          </w:p>
+        </w:tc>
+      </w:tr>
+      <w:tr>
+        <w:trPr>
+          <w:cantSplit/>
+        </w:trPr>
+        <w:tc>
+          <w:tcPr>
+            <w:tcW w:type="dxa" w:w="1166"/>
+            <w:tcMar>
+              <w:top w:w="80" w:type="dxa"/>
+              <w:start w:w="110" w:type="dxa"/>
+              <w:bottom w:w="80" w:type="dxa"/>
+              <w:end w:w="110" w:type="dxa"/>
+            </w:tcMar>
+            <w:vAlign w:val="center"/>
+          </w:tcPr>
+          <w:p>
+            <w:pPr>
+              <w:keepNext/>
+              <w:spacing w:after="0"/>
+              <w:jc w:val="left"/>
+            </w:pPr>
+            <w:r>
+              <w:rPr>
+                <w:rFonts w:ascii="Malgun Gothic" w:hAnsi="Malgun Gothic" w:eastAsia="Malgun Gothic"/>
+                <w:color w:val="12202F"/>
+                <w:sz w:val="15"/>
+              </w:rPr>
+              <w:t>transformer</w:t>
+            </w:r>
+          </w:p>
+        </w:tc>
+        <w:tc>
+          <w:tcPr>
+            <w:tcW w:type="dxa" w:w="1166"/>
+            <w:tcMar>
+              <w:top w:w="80" w:type="dxa"/>
+              <w:start w:w="110" w:type="dxa"/>
+              <w:bottom w:w="80" w:type="dxa"/>
+              <w:end w:w="110" w:type="dxa"/>
+            </w:tcMar>
+            <w:vAlign w:val="center"/>
+          </w:tcPr>
+          <w:p>
+            <w:pPr>
+              <w:keepNext/>
+              <w:spacing w:after="0"/>
+              <w:jc w:val="center"/>
+            </w:pPr>
+            <w:r>
+              <w:rPr>
+                <w:rFonts w:ascii="Malgun Gothic" w:hAnsi="Malgun Gothic" w:eastAsia="Malgun Gothic"/>
+                <w:color w:val="12202F"/>
+                <w:sz w:val="15"/>
+              </w:rPr>
+              <w:t>60</w:t>
+            </w:r>
+          </w:p>
+        </w:tc>
+        <w:tc>
+          <w:tcPr>
+            <w:tcW w:type="dxa" w:w="1166"/>
+            <w:tcMar>
+              <w:top w:w="80" w:type="dxa"/>
+              <w:start w:w="110" w:type="dxa"/>
+              <w:bottom w:w="80" w:type="dxa"/>
+              <w:end w:w="110" w:type="dxa"/>
+            </w:tcMar>
+            <w:vAlign w:val="center"/>
+          </w:tcPr>
+          <w:p>
+            <w:pPr>
+              <w:keepNext/>
+              <w:spacing w:after="0"/>
+              <w:jc w:val="center"/>
+            </w:pPr>
+            <w:r>
+              <w:rPr>
+                <w:rFonts w:ascii="Malgun Gothic" w:hAnsi="Malgun Gothic" w:eastAsia="Malgun Gothic"/>
+                <w:color w:val="12202F"/>
+                <w:sz w:val="15"/>
+              </w:rPr>
+              <w:t>0.809442</w:t>
+            </w:r>
+          </w:p>
+        </w:tc>
+        <w:tc>
+          <w:tcPr>
+            <w:tcW w:type="dxa" w:w="1166"/>
+            <w:tcMar>
+              <w:top w:w="80" w:type="dxa"/>
+              <w:start w:w="110" w:type="dxa"/>
+              <w:bottom w:w="80" w:type="dxa"/>
+              <w:end w:w="110" w:type="dxa"/>
+            </w:tcMar>
+            <w:vAlign w:val="center"/>
+          </w:tcPr>
+          <w:p>
+            <w:pPr>
+              <w:keepNext/>
+              <w:spacing w:after="0"/>
+              <w:jc w:val="center"/>
+            </w:pPr>
+            <w:r>
+              <w:rPr>
+                <w:rFonts w:ascii="Malgun Gothic" w:hAnsi="Malgun Gothic" w:eastAsia="Malgun Gothic"/>
+                <w:color w:val="12202F"/>
+                <w:sz w:val="15"/>
+              </w:rPr>
+              <w:t>0.937495</w:t>
+            </w:r>
+          </w:p>
+        </w:tc>
+        <w:tc>
+          <w:tcPr>
+            <w:tcW w:type="dxa" w:w="1166"/>
+            <w:tcMar>
+              <w:top w:w="80" w:type="dxa"/>
+              <w:start w:w="110" w:type="dxa"/>
+              <w:bottom w:w="80" w:type="dxa"/>
+              <w:end w:w="110" w:type="dxa"/>
+            </w:tcMar>
+            <w:vAlign w:val="center"/>
+          </w:tcPr>
+          <w:p>
+            <w:pPr>
+              <w:keepNext/>
+              <w:spacing w:after="0"/>
+              <w:jc w:val="center"/>
+            </w:pPr>
+            <w:r>
+              <w:rPr>
+                <w:rFonts w:ascii="Malgun Gothic" w:hAnsi="Malgun Gothic" w:eastAsia="Malgun Gothic"/>
+                <w:color w:val="12202F"/>
+                <w:sz w:val="15"/>
+              </w:rPr>
+              <w:t>0.682143</w:t>
+            </w:r>
+          </w:p>
+        </w:tc>
+        <w:tc>
+          <w:tcPr>
+            <w:tcW w:type="dxa" w:w="1166"/>
+            <w:tcMar>
+              <w:top w:w="80" w:type="dxa"/>
+              <w:start w:w="110" w:type="dxa"/>
+              <w:bottom w:w="80" w:type="dxa"/>
+              <w:end w:w="110" w:type="dxa"/>
+            </w:tcMar>
+            <w:vAlign w:val="center"/>
+          </w:tcPr>
+          <w:p>
+            <w:pPr>
+              <w:keepNext/>
+              <w:spacing w:after="0"/>
+              <w:jc w:val="center"/>
+            </w:pPr>
+            <w:r>
+              <w:rPr>
+                <w:rFonts w:ascii="Malgun Gothic" w:hAnsi="Malgun Gothic" w:eastAsia="Malgun Gothic"/>
+                <w:color w:val="12202F"/>
+                <w:sz w:val="15"/>
+              </w:rPr>
+              <w:t>27.560209</w:t>
+            </w:r>
+          </w:p>
+        </w:tc>
+        <w:tc>
+          <w:tcPr>
+            <w:tcW w:type="dxa" w:w="1166"/>
+            <w:tcMar>
+              <w:top w:w="80" w:type="dxa"/>
+              <w:start w:w="110" w:type="dxa"/>
+              <w:bottom w:w="80" w:type="dxa"/>
+              <w:end w:w="110" w:type="dxa"/>
+            </w:tcMar>
+            <w:vAlign w:val="center"/>
+          </w:tcPr>
+          <w:p>
+            <w:pPr>
+              <w:keepNext/>
+              <w:spacing w:after="0"/>
+              <w:jc w:val="center"/>
+            </w:pPr>
+            <w:r>
+              <w:rPr>
+                <w:rFonts w:ascii="Malgun Gothic" w:hAnsi="Malgun Gothic" w:eastAsia="Malgun Gothic"/>
+                <w:color w:val="12202F"/>
+                <w:sz w:val="15"/>
+              </w:rPr>
+              <w:t>464.117857</w:t>
+            </w:r>
+          </w:p>
+        </w:tc>
+        <w:tc>
+          <w:tcPr>
+            <w:tcW w:type="dxa" w:w="1166"/>
+            <w:tcMar>
+              <w:top w:w="80" w:type="dxa"/>
+              <w:start w:w="110" w:type="dxa"/>
+              <w:bottom w:w="80" w:type="dxa"/>
+              <w:end w:w="110" w:type="dxa"/>
+            </w:tcMar>
+            <w:vAlign w:val="center"/>
+          </w:tcPr>
+          <w:p>
+            <w:pPr>
+              <w:keepNext/>
+              <w:spacing w:after="0"/>
+              <w:jc w:val="center"/>
+            </w:pPr>
+            <w:r>
+              <w:rPr>
+                <w:rFonts w:ascii="Malgun Gothic" w:hAnsi="Malgun Gothic" w:eastAsia="Malgun Gothic"/>
+                <w:color w:val="12202F"/>
+                <w:sz w:val="15"/>
+              </w:rPr>
+              <w:t>0.010140</w:t>
+            </w:r>
+          </w:p>
+        </w:tc>
+      </w:tr>
+      <w:tr>
+        <w:trPr>
+          <w:cantSplit/>
+        </w:trPr>
+        <w:tc>
+          <w:tcPr>
+            <w:tcW w:type="dxa" w:w="1166"/>
+            <w:tcMar>
+              <w:top w:w="80" w:type="dxa"/>
+              <w:start w:w="110" w:type="dxa"/>
+              <w:bottom w:w="80" w:type="dxa"/>
+              <w:end w:w="110" w:type="dxa"/>
+            </w:tcMar>
+            <w:vAlign w:val="center"/>
+          </w:tcPr>
+          <w:p>
+            <w:pPr>
+              <w:spacing w:after="0"/>
+              <w:jc w:val="left"/>
+            </w:pPr>
+            <w:r>
+              <w:rPr>
+                <w:rFonts w:ascii="Malgun Gothic" w:hAnsi="Malgun Gothic" w:eastAsia="Malgun Gothic"/>
+                <w:color w:val="12202F"/>
+                <w:sz w:val="15"/>
+              </w:rPr>
+              <w:t>transformer</w:t>
+            </w:r>
+          </w:p>
+        </w:tc>
+        <w:tc>
+          <w:tcPr>
+            <w:tcW w:type="dxa" w:w="1166"/>
+            <w:tcMar>
+              <w:top w:w="80" w:type="dxa"/>
+              <w:start w:w="110" w:type="dxa"/>
+              <w:bottom w:w="80" w:type="dxa"/>
+              <w:end w:w="110" w:type="dxa"/>
+            </w:tcMar>
+            <w:vAlign w:val="center"/>
+          </w:tcPr>
+          <w:p>
+            <w:pPr>
+              <w:spacing w:after="0"/>
+              <w:jc w:val="center"/>
+            </w:pPr>
+            <w:r>
+              <w:rPr>
+                <w:rFonts w:ascii="Malgun Gothic" w:hAnsi="Malgun Gothic" w:eastAsia="Malgun Gothic"/>
+                <w:color w:val="12202F"/>
+                <w:sz w:val="15"/>
+              </w:rPr>
+              <w:t>120</w:t>
+            </w:r>
+          </w:p>
+        </w:tc>
+        <w:tc>
+          <w:tcPr>
+            <w:tcW w:type="dxa" w:w="1166"/>
+            <w:tcMar>
+              <w:top w:w="80" w:type="dxa"/>
+              <w:start w:w="110" w:type="dxa"/>
+              <w:bottom w:w="80" w:type="dxa"/>
+              <w:end w:w="110" w:type="dxa"/>
+            </w:tcMar>
+            <w:vAlign w:val="center"/>
+          </w:tcPr>
+          <w:p>
+            <w:pPr>
+              <w:spacing w:after="0"/>
+              <w:jc w:val="center"/>
+            </w:pPr>
+            <w:r>
+              <w:rPr>
+                <w:rFonts w:ascii="Malgun Gothic" w:hAnsi="Malgun Gothic" w:eastAsia="Malgun Gothic"/>
+                <w:color w:val="12202F"/>
+                <w:sz w:val="15"/>
+              </w:rPr>
+              <w:t>0.806637</w:t>
+            </w:r>
+          </w:p>
+        </w:tc>
+        <w:tc>
+          <w:tcPr>
+            <w:tcW w:type="dxa" w:w="1166"/>
+            <w:tcMar>
+              <w:top w:w="80" w:type="dxa"/>
+              <w:start w:w="110" w:type="dxa"/>
+              <w:bottom w:w="80" w:type="dxa"/>
+              <w:end w:w="110" w:type="dxa"/>
+            </w:tcMar>
+            <w:vAlign w:val="center"/>
+          </w:tcPr>
+          <w:p>
+            <w:pPr>
+              <w:spacing w:after="0"/>
+              <w:jc w:val="center"/>
+            </w:pPr>
+            <w:r>
+              <w:rPr>
+                <w:rFonts w:ascii="Malgun Gothic" w:hAnsi="Malgun Gothic" w:eastAsia="Malgun Gothic"/>
+                <w:color w:val="12202F"/>
+                <w:sz w:val="15"/>
+              </w:rPr>
+              <w:t>0.936276</w:t>
+            </w:r>
+          </w:p>
+        </w:tc>
+        <w:tc>
+          <w:tcPr>
+            <w:tcW w:type="dxa" w:w="1166"/>
+            <w:tcMar>
+              <w:top w:w="80" w:type="dxa"/>
+              <w:start w:w="110" w:type="dxa"/>
+              <w:bottom w:w="80" w:type="dxa"/>
+              <w:end w:w="110" w:type="dxa"/>
+            </w:tcMar>
+            <w:vAlign w:val="center"/>
+          </w:tcPr>
+          <w:p>
+            <w:pPr>
+              <w:spacing w:after="0"/>
+              <w:jc w:val="center"/>
+            </w:pPr>
+            <w:r>
+              <w:rPr>
+                <w:rFonts w:ascii="Malgun Gothic" w:hAnsi="Malgun Gothic" w:eastAsia="Malgun Gothic"/>
+                <w:color w:val="12202F"/>
+                <w:sz w:val="15"/>
+              </w:rPr>
+              <w:t>0.678571</w:t>
+            </w:r>
+          </w:p>
+        </w:tc>
+        <w:tc>
+          <w:tcPr>
+            <w:tcW w:type="dxa" w:w="1166"/>
+            <w:tcMar>
+              <w:top w:w="80" w:type="dxa"/>
+              <w:start w:w="110" w:type="dxa"/>
+              <w:bottom w:w="80" w:type="dxa"/>
+              <w:end w:w="110" w:type="dxa"/>
+            </w:tcMar>
+            <w:vAlign w:val="center"/>
+          </w:tcPr>
+          <w:p>
+            <w:pPr>
+              <w:spacing w:after="0"/>
+              <w:jc w:val="center"/>
+            </w:pPr>
+            <w:r>
+              <w:rPr>
+                <w:rFonts w:ascii="Malgun Gothic" w:hAnsi="Malgun Gothic" w:eastAsia="Malgun Gothic"/>
+                <w:color w:val="12202F"/>
+                <w:sz w:val="15"/>
+              </w:rPr>
+              <w:t>24.442105</w:t>
+            </w:r>
+          </w:p>
+        </w:tc>
+        <w:tc>
+          <w:tcPr>
+            <w:tcW w:type="dxa" w:w="1166"/>
+            <w:tcMar>
+              <w:top w:w="80" w:type="dxa"/>
+              <w:start w:w="110" w:type="dxa"/>
+              <w:bottom w:w="80" w:type="dxa"/>
+              <w:end w:w="110" w:type="dxa"/>
+            </w:tcMar>
+            <w:vAlign w:val="center"/>
+          </w:tcPr>
+          <w:p>
+            <w:pPr>
+              <w:spacing w:after="0"/>
+              <w:jc w:val="center"/>
+            </w:pPr>
+            <w:r>
+              <w:rPr>
+                <w:rFonts w:ascii="Malgun Gothic" w:hAnsi="Malgun Gothic" w:eastAsia="Malgun Gothic"/>
+                <w:color w:val="12202F"/>
+                <w:sz w:val="15"/>
+              </w:rPr>
+              <w:t>466.907143</w:t>
+            </w:r>
+          </w:p>
+        </w:tc>
+        <w:tc>
+          <w:tcPr>
+            <w:tcW w:type="dxa" w:w="1166"/>
+            <w:tcMar>
+              <w:top w:w="80" w:type="dxa"/>
+              <w:start w:w="110" w:type="dxa"/>
+              <w:bottom w:w="80" w:type="dxa"/>
+              <w:end w:w="110" w:type="dxa"/>
+            </w:tcMar>
+            <w:vAlign w:val="center"/>
+          </w:tcPr>
+          <w:p>
+            <w:pPr>
+              <w:spacing w:after="0"/>
+              <w:jc w:val="center"/>
+            </w:pPr>
+            <w:r>
+              <w:rPr>
+                <w:rFonts w:ascii="Malgun Gothic" w:hAnsi="Malgun Gothic" w:eastAsia="Malgun Gothic"/>
+                <w:color w:val="12202F"/>
+                <w:sz w:val="15"/>
+              </w:rPr>
+              <w:t>0.009950</w:t>
+            </w:r>
+          </w:p>
+        </w:tc>
+      </w:tr>
+    </w:tbl>
+    <w:p>
+      <w:pPr>
+        <w:spacing w:after="40"/>
+      </w:pPr>
+    </w:p>
+    <w:p>
+      <w:r>
+        <w:rPr>
+          <w:rFonts w:ascii="Malgun Gothic" w:hAnsi="Malgun Gothic" w:eastAsia="Malgun Gothic"/>
+          <w:color w:val="12202F"/>
+          <w:sz w:val="20"/>
+        </w:rPr>
+        <w:t>F1의 탐지 run 비율은 약 67.86–68.75%로 미탐 run도 약 31–32% 남았다. 고장 이전 sample FPR은 약 0.99–1.02%이다. 3연속 경보의 고장 이전 run alarm 비율이 0이라는 결과는 sample FPR이 0이라는 뜻이 아니다. 정상 validation을 checkpoint 선택과 threshold 설정에 함께 사용했으며 별도 독립 calibration 자료를 둔 실험은 아니다.</w:t>
+      </w:r>
+    </w:p>
+    <w:p>
+      <w:r>
+        <w:rPr>
+          <w:rFonts w:ascii="Malgun Gothic" w:hAnsi="Malgun Gothic" w:eastAsia="Malgun Gothic"/>
+          <w:color w:val="12202F"/>
+          <w:sz w:val="20"/>
+        </w:rPr>
+        <w:t>긴 window가 일관된 이득을 주지는 않았다. 이 표만으로 최적 window나 새로운 방법의 성능 우위를 확정하지 않는다. 1B는 단일 model seed47이고 이미 관찰한 개발 run을 재사용했으므로 독립적인 일반화 검증이나 새로운 통계적 유의성의 근거가 아니다. Transformer F0와 F0-C는 동일 구조이므로 독립적인 두 구조의 지지로 세지 않는다. 1B의 TCN은 1A의 두 층에서 여섯 층으로 바뀌었고 공통 평가 구간도 조정되었으므로 1A와 1B의 직접 수치 차이를 window만의 인과적 효과로 해석할 수 없다. 이 보충 결과는 학습 조건의 한계를 공개하는 자료이며 기존 채널 감사 결과의 수치를 대체하지 않는다.</w:t>
+      </w:r>
+    </w:p>
+    <w:p>
+      <w:pPr>
         <w:pStyle w:val="Heading1"/>
       </w:pPr>
       <w:r>
@@ -11348,6 +12977,7 @@
       </w:r>
     </w:p>
     <w:sectPr>
+      <w:footerReference w:type="default" r:id="rId9"/>
       <w:pgSz w:w="11906" w:h="16838"/>
       <w:pgMar w:top="1077" w:right="1247" w:bottom="1219" w:left="1247" w:header="425" w:footer="425" w:gutter="0"/>
       <w:cols w:space="720"/>
@@ -11355,6 +12985,18 @@
     </w:sectPr>
   </w:body>
 </w:document>
+</file>
+
+<file path=word/footer1.xml><?xml version="1.0" encoding="utf-8"?>
+<w:ftr xmlns:m="http://schemas.openxmlformats.org/officeDocument/2006/math" xmlns:mc="http://schemas.openxmlformats.org/markup-compatibility/2006" xmlns:mo="http://schemas.microsoft.com/office/mac/office/2008/main" xmlns:mv="urn:schemas-microsoft-com:mac:vml" xmlns:o="urn:schemas-microsoft-com:office:office" xmlns:r="http://schemas.openxmlformats.org/officeDocument/2006/relationships" xmlns:v="urn:schemas-microsoft-com:vml" xmlns:w10="urn:schemas-microsoft-com:office:word" xmlns:w14="http://schemas.microsoft.com/office/word/2010/wordml" xmlns:w="http://schemas.openxmlformats.org/wordprocessingml/2006/main" xmlns:wne="http://schemas.microsoft.com/office/word/2006/wordml" xmlns:wp14="http://schemas.microsoft.com/office/word/2010/wordprocessingDrawing" xmlns:wp="http://schemas.openxmlformats.org/drawingml/2006/wordprocessingDrawing" xmlns:wpc="http://schemas.microsoft.com/office/word/2010/wordprocessingCanvas" xmlns:wpg="http://schemas.microsoft.com/office/word/2010/wordprocessingGroup" xmlns:wpi="http://schemas.microsoft.com/office/word/2010/wordprocessingInk" xmlns:wps="http://schemas.microsoft.com/office/word/2010/wordprocessingShape" mc:Ignorable="w14 wp14">
+  <w:p>
+    <w:pPr>
+      <w:pStyle w:val="Footer"/>
+      <w:jc w:val="center"/>
+    </w:pPr>
+    <w:fldSimple w:instr="PAGE"/>
+  </w:p>
+</w:ftr>
 </file>
 
 <file path=word/numbering.xml><?xml version="1.0" encoding="utf-8"?>

</xml_diff>